<commit_message>
v4.0.0: fixed-grid UI overhaul, Live CC, per-channel mpv compatibility mode, semi-auto EPG, stream info, volume boost, clear history
UI upgrade (community feedback):
- Fixed, roomy layout — nav/category panels no longer expand/collapse; full category labels; app-wide
- Stream technical info overlay in the player (both engines)
- Volume boost to 150% (mpv); per-profile Startup (Home / Last channel / Live·Favorites)
- Detailed channel search (category · number); Animations simplified to On/Off

Live TV:
- Closed captions (CEA-608/708) on Live TV
- Per-channel "compatibility mode" (pin a channel to mpv) + synchronous codec queueing for UHD
- Semi-auto EPG sync after import (live progress) — now also shows in the EPG list

Plus clear watch history, A/V-sync nudge, in-player channel list, robust Xtream import, donation link.
</commit_message>
<xml_diff>
--- a/extras/OwnTV_Complete_Brief_Plan_With_Logo.docx
+++ b/extras/OwnTV_Complete_Brief_Plan_With_Logo.docx
@@ -63,7 +63,7 @@
         <w:rPr>
           <w:rFonts w:ascii="Cambria" w:hAnsi="Cambria" w:eastAsia="Cambria" w:cs="Cambria"/>
         </w:rPr>
-        <w:t>Native Android TV IPTV Player  •  As-built, v3.2.0</w:t>
+        <w:t>Native Android TV IPTV Player  •  As-built, v4.0.0</w:t>
       </w:r>
       <w:r>
         <w:rPr>
@@ -1466,6 +1466,38 @@
     </w:p>
     <w:p>
       <w:pPr>
+        <w:pStyle w:val="723"/>
+      </w:pPr>
+      <w:r>
+        <w:t>Closed captions (CC) on Live TV: channels that embed CEA-608/708 captions in the video stream (e.g. US channels like HBO/Showtime/Cinemax) now expose a selectable caption track in the Subtitles menu instead of only "Off" — ExoPlayer via DefaultHlsExtractorFactory(exposeCea608WhenMissingDeclarations), with mpv's sub-create-cc-track as the raw-TS / fallback net.</w:t>
+      </w:r>
+    </w:p>
+    <w:p>
+      <w:pPr>
+        <w:pStyle w:val="723"/>
+      </w:pPr>
+      <w:r>
+        <w:t>Per-channel compatibility mode: a gear toggle in the live HUD pins a channel to the mpv engine (fixes UHD-HEVC artifacts and streams ExoPlayer can't decode), remembered per channel by stream URL so it opens straight on mpv every time after — while other channels keep the near-instant ExoPlayer start. ExoPlayer also runs MediaCodec synchronously (forceDisableMediaCodecAsynchronousQueueing) to cut UHD artifacts at the source.</w:t>
+      </w:r>
+    </w:p>
+    <w:p>
+      <w:pPr>
+        <w:pStyle w:val="723"/>
+      </w:pPr>
+      <w:r>
+        <w:t>Stream technical info overlay: an info button in the player shows a live readout — video codec/resolution/fps/bit-depth, HDR type, bitrate, decoder (hw/sw, direct), audio codec/channels/rate, buffer &amp; dropped frames, and the credential-masked source; works on both engines.</w:t>
+      </w:r>
+    </w:p>
+    <w:p>
+      <w:pPr>
+        <w:pStyle w:val="723"/>
+      </w:pPr>
+      <w:r>
+        <w:t>Volume boost to 150%: movies, series and any mpv-played channel can amplify above 100% (Kodi-style, capped at 150% with mpv's soft limiter) for quiet streams. The ExoPlayer live engine stays at 100%.</w:t>
+      </w:r>
+    </w:p>
+    <w:p>
+      <w:pPr>
         <w:pStyle w:val="693"/>
         <w:pBdr/>
         <w:spacing/>
@@ -3663,6 +3695,118 @@
       </w:pPr>
       <w:r>
         <w:t>v3.2.0 - Audio-track icon redrawn as a music note (OwnTVIcon.AUDIO) so it's no longer confused with the speaker/volume button.</w:t>
+      </w:r>
+    </w:p>
+    <w:p>
+      <w:pPr>
+        <w:pStyle w:val="694"/>
+      </w:pPr>
+      <w:r>
+        <w:t>12.21 v4.0.0: EPG speed &amp; resilience, TV-first navigation, list view, import robustness</w:t>
+      </w:r>
+    </w:p>
+    <w:p>
+      <w:pPr>
+        <w:pStyle w:val="723"/>
+      </w:pPr>
+      <w:r>
+        <w:t>v4.0.0 — Much faster, lighter EPG sync: the guide now stores programmes only for the channels you actually have (public XMLTV feeds carry ~10–20× more), parsed while streaming and mirrored to a 24h local cache file; a smart-match then tops up that channel's programmes instantly from the cache with no network round-trip.</w:t>
+      </w:r>
+    </w:p>
+    <w:p>
+      <w:pPr>
+        <w:pStyle w:val="723"/>
+      </w:pPr>
+      <w:r>
+        <w:t>v4.0.0 — Guide opens instantly: the EpgViewModel is pre-loaded in the background at startup and keeps its list across re-entry (no spinner/rebuild on every open). A permanent epg_programmes(sourceId, epgChannelId) index — ensured at startup and after each sync via CREATE INDEX IF NOT EXISTS — turns the 'channels with guide' lookup from a multi-second scan into an index scan; the match-apply path was de-stormed (one bulk query instead of two per match).</w:t>
+      </w:r>
+    </w:p>
+    <w:p>
+      <w:pPr>
+        <w:pStyle w:val="723"/>
+      </w:pPr>
+      <w:r>
+        <w:t>v4.0.0 — EPG no longer dies on a malformed feed: KXmlParser relaxed mode plus a tolerant text reader (replacing nextText) and a salvage-partial path mean one bad &lt;programme&gt;/&lt;title&gt; tag no longer aborts the whole sync with 'END_TAG expected'.</w:t>
+      </w:r>
+    </w:p>
+    <w:p>
+      <w:pPr>
+        <w:pStyle w:val="723"/>
+      </w:pPr>
+      <w:r>
+        <w:t>v4.0.0 — Resilient Xtream imports: a provider that errors on the bulk get_series/get_vod (a non-standard HTTP 512 = Xui.one/WAF 'response too large') now falls back to per-category requests (paced ~150ms to avoid rate-limits, skipping a failing category and continuing). Movies/Series steps are non-fatal so the channels still import, and credentials are redacted from HTTP error messages.</w:t>
+      </w:r>
+    </w:p>
+    <w:p>
+      <w:pPr>
+        <w:pStyle w:val="723"/>
+      </w:pPr>
+      <w:r>
+        <w:t>v4.0.0 — In-player channel list: while a live channel plays full-screen with the controls hidden, Left slides a channel list over the video to switch channels without leaving full-screen (Back / Left again closes it).</w:t>
+      </w:r>
+    </w:p>
+    <w:p>
+      <w:pPr>
+        <w:pStyle w:val="723"/>
+      </w:pPr>
+      <w:r>
+        <w:t>v4.0.0 — Live TV remembers where you were: it reopens on the last selected category and lands focus on the last channel you were on; an opt-in 'Resume last channel on startup' (Settings → Playback, default off) reopens straight into it.</w:t>
+      </w:r>
+    </w:p>
+    <w:p>
+      <w:pPr>
+        <w:pStyle w:val="723"/>
+      </w:pPr>
+      <w:r>
+        <w:t>v4.0.0 — Guide filters: the guide's sort gained a Favorites option (just your favourited channels), plus a Category filter with its own search box to view one group at a time.</w:t>
+      </w:r>
+    </w:p>
+    <w:p>
+      <w:pPr>
+        <w:pStyle w:val="723"/>
+      </w:pPr>
+      <w:r>
+        <w:t>v4.0.0 — Movies &amp; Series Grid/List view toggle: switch the poster wall to a compact list to see far more titles at once.</w:t>
+      </w:r>
+    </w:p>
+    <w:p>
+      <w:pPr>
+        <w:pStyle w:val="723"/>
+      </w:pPr>
+      <w:r>
+        <w:t>v4.0.0 — Clear watch history: wipe a profile's recently-watched / continue rows — all of it, or just Live TV / Movies / Series — behind a confirm; playlists, favorites and downloads are untouched.</w:t>
+      </w:r>
+    </w:p>
+    <w:p>
+      <w:pPr>
+        <w:pStyle w:val="723"/>
+      </w:pPr>
+      <w:r>
+        <w:t>v4.0.0 — Quality-of-life: favorite a channel from global search via long-press; jump a Customize category straight to the top/bottom (alongside one-step up/down); an Animations setting (Full / Reduced / Off) to tone down motion on lower-end TV boxes.</w:t>
+      </w:r>
+    </w:p>
+    <w:p>
+      <w:pPr>
+        <w:pStyle w:val="723"/>
+      </w:pPr>
+      <w:r>
+        <w:t>v4.0.0 — Screensaver restore: pausing a movie/episode and leaving the TV long enough for the screensaver no longer leaves a dead stream — the app restores it paused at the exact position on return, so Play just resumes.</w:t>
+      </w:r>
+    </w:p>
+    <w:p>
+      <w:pPr>
+        <w:pStyle w:val="723"/>
+      </w:pPr>
+      <w:r>
+        <w:t>v4.0.0 — Project: added GitHub issue templates (bug report asking for the on-screen 'err:' line / screenshot / duplicate &amp; settings checks, feature request, Telegram contact link) and an enhanced PR template stressing real-TV testing.</w:t>
+      </w:r>
+    </w:p>
+    <w:p>
+      <w:pPr>
+        <w:pStyle w:val="723"/>
+      </w:pPr>
+      <w:r>
+        <w:t>v4.0.0 — UI upgrade (3 phases): Phase 1 stream-info overlay + volume boost; Phase 2 the FIXED grid — fixed icon nav + full-label category column + fixed Live panes, no expand/collapse so the layout never jumps on the D-pad (faster on low-end boxes), profile-avatar click switches profile; Phase 3 per-profile Startup (Home / Last channel / Live·Favorites) and detailed channel search results (category, channel number). Animations setting simplified to On/Off.</w:t>
       </w:r>
     </w:p>
     <w:sectPr>

</xml_diff>